<commit_message>
fixes #358, fixes #357, adds motion for default judgment to JOD-only when user is defendant
</commit_message>
<xml_diff>
--- a/docassemble/MLHDivorceAndCustody/data/templates/noh_motion_default.docx
+++ b/docassemble/MLHDivorceAndCustody/data/templates/noh_motion_default.docx
@@ -1913,7 +1913,77 @@
           <w:sz w:val="22"/>
           <w:szCs w:val="22"/>
         </w:rPr>
-        <w:t>Moving party: Plaintiff</w:t>
+        <w:t xml:space="preserve">Moving party: </w:t>
+      </w:r>
+      <w:r>
+        <w:rPr>
+          <w:rFonts w:ascii="Times New Roman" w:eastAsia="Aptos" w:hAnsi="Times New Roman" w:cs="Times New Roman"/>
+          <w:sz w:val="22"/>
+          <w:szCs w:val="22"/>
+        </w:rPr>
+        <w:t xml:space="preserve">{% if </w:t>
+      </w:r>
+      <w:proofErr w:type="spellStart"/>
+      <w:r>
+        <w:rPr>
+          <w:rFonts w:ascii="Times New Roman" w:eastAsia="Aptos" w:hAnsi="Times New Roman" w:cs="Times New Roman"/>
+          <w:sz w:val="22"/>
+          <w:szCs w:val="22"/>
+        </w:rPr>
+        <w:t>user_ask_role</w:t>
+      </w:r>
+      <w:proofErr w:type="spellEnd"/>
+      <w:r>
+        <w:rPr>
+          <w:rFonts w:ascii="Times New Roman" w:eastAsia="Aptos" w:hAnsi="Times New Roman" w:cs="Times New Roman"/>
+          <w:sz w:val="22"/>
+          <w:szCs w:val="22"/>
+        </w:rPr>
+        <w:t xml:space="preserve"> == “plaintiff” </w:t>
+      </w:r>
+      <w:proofErr w:type="gramStart"/>
+      <w:r>
+        <w:rPr>
+          <w:rFonts w:ascii="Times New Roman" w:eastAsia="Aptos" w:hAnsi="Times New Roman" w:cs="Times New Roman"/>
+          <w:sz w:val="22"/>
+          <w:szCs w:val="22"/>
+        </w:rPr>
+        <w:t>%}</w:t>
+      </w:r>
+      <w:r>
+        <w:rPr>
+          <w:rFonts w:ascii="Times New Roman" w:eastAsia="Aptos" w:hAnsi="Times New Roman" w:cs="Times New Roman"/>
+          <w:sz w:val="22"/>
+          <w:szCs w:val="22"/>
+        </w:rPr>
+        <w:t>Plaintiff</w:t>
+      </w:r>
+      <w:proofErr w:type="gramEnd"/>
+      <w:r>
+        <w:rPr>
+          <w:rFonts w:ascii="Times New Roman" w:eastAsia="Aptos" w:hAnsi="Times New Roman" w:cs="Times New Roman"/>
+          <w:sz w:val="22"/>
+          <w:szCs w:val="22"/>
+        </w:rPr>
+        <w:t xml:space="preserve">{% else </w:t>
+      </w:r>
+      <w:proofErr w:type="gramStart"/>
+      <w:r>
+        <w:rPr>
+          <w:rFonts w:ascii="Times New Roman" w:eastAsia="Aptos" w:hAnsi="Times New Roman" w:cs="Times New Roman"/>
+          <w:sz w:val="22"/>
+          <w:szCs w:val="22"/>
+        </w:rPr>
+        <w:t>%}Defendant</w:t>
+      </w:r>
+      <w:proofErr w:type="gramEnd"/>
+      <w:r>
+        <w:rPr>
+          <w:rFonts w:ascii="Times New Roman" w:eastAsia="Aptos" w:hAnsi="Times New Roman" w:cs="Times New Roman"/>
+          <w:sz w:val="22"/>
+          <w:szCs w:val="22"/>
+        </w:rPr>
+        <w:t>{% endif %}</w:t>
       </w:r>
     </w:p>
     <w:p>
@@ -2043,12 +2113,47 @@
     </w:p>
     <w:p>
       <w:pPr>
+        <w:spacing w:after="120" w:line="240" w:lineRule="auto"/>
+        <w:rPr>
+          <w:rFonts w:ascii="Times New Roman" w:eastAsia="Aptos" w:hAnsi="Times New Roman" w:cs="Times New Roman"/>
+          <w:sz w:val="22"/>
+          <w:szCs w:val="22"/>
+        </w:rPr>
+      </w:pPr>
+      <w:r>
+        <w:rPr>
+          <w:rFonts w:ascii="Times New Roman" w:eastAsia="Aptos" w:hAnsi="Times New Roman" w:cs="Times New Roman"/>
+          <w:sz w:val="22"/>
+          <w:szCs w:val="22"/>
+        </w:rPr>
+        <w:t xml:space="preserve">{%p if </w:t>
+      </w:r>
+      <w:proofErr w:type="spellStart"/>
+      <w:r>
+        <w:rPr>
+          <w:rFonts w:ascii="Times New Roman" w:eastAsia="Aptos" w:hAnsi="Times New Roman" w:cs="Times New Roman"/>
+          <w:sz w:val="22"/>
+          <w:szCs w:val="22"/>
+        </w:rPr>
+        <w:t>user_ask_role</w:t>
+      </w:r>
+      <w:proofErr w:type="spellEnd"/>
+      <w:r>
+        <w:rPr>
+          <w:rFonts w:ascii="Times New Roman" w:eastAsia="Aptos" w:hAnsi="Times New Roman" w:cs="Times New Roman"/>
+          <w:sz w:val="22"/>
+          <w:szCs w:val="22"/>
+        </w:rPr>
+        <w:t xml:space="preserve"> == “plaintiff” %}</w:t>
+      </w:r>
+    </w:p>
+    <w:p>
+      <w:pPr>
         <w:numPr>
           <w:ilvl w:val="0"/>
           <w:numId w:val="6"/>
         </w:numPr>
-        <w:spacing w:after="120" w:line="240" w:lineRule="auto"/>
-        <w:ind w:left="360"/>
+        <w:spacing w:line="240" w:lineRule="auto"/>
         <w:rPr>
           <w:rFonts w:ascii="Times New Roman" w:eastAsia="Aptos" w:hAnsi="Times New Roman" w:cs="Times New Roman"/>
           <w:sz w:val="22"/>
@@ -2248,8 +2353,7 @@
           <w:ilvl w:val="0"/>
           <w:numId w:val="6"/>
         </w:numPr>
-        <w:spacing w:after="120" w:line="240" w:lineRule="auto"/>
-        <w:ind w:left="360"/>
+        <w:spacing w:line="240" w:lineRule="auto"/>
         <w:rPr>
           <w:rFonts w:ascii="Times New Roman" w:eastAsia="Aptos" w:hAnsi="Times New Roman" w:cs="Times New Roman"/>
           <w:sz w:val="22"/>
@@ -2271,7 +2375,85 @@
           <w:ilvl w:val="0"/>
           <w:numId w:val="6"/>
         </w:numPr>
-        <w:spacing w:after="120" w:line="240" w:lineRule="auto"/>
+        <w:spacing w:line="240" w:lineRule="auto"/>
+        <w:rPr>
+          <w:rFonts w:ascii="Times New Roman" w:eastAsia="Aptos" w:hAnsi="Times New Roman" w:cs="Times New Roman"/>
+          <w:sz w:val="22"/>
+          <w:szCs w:val="22"/>
+        </w:rPr>
+      </w:pPr>
+      <w:r>
+        <w:rPr>
+          <w:rFonts w:ascii="Times New Roman" w:eastAsia="Aptos" w:hAnsi="Times New Roman" w:cs="Times New Roman"/>
+          <w:sz w:val="22"/>
+          <w:szCs w:val="22"/>
+        </w:rPr>
+        <w:t xml:space="preserve">Defendant </w:t>
+      </w:r>
+      <w:proofErr w:type="gramStart"/>
+      <w:r>
+        <w:rPr>
+          <w:rFonts w:ascii="Times New Roman" w:eastAsia="Aptos" w:hAnsi="Times New Roman" w:cs="Times New Roman"/>
+          <w:sz w:val="22"/>
+          <w:szCs w:val="22"/>
+        </w:rPr>
+        <w:t>[ ]</w:t>
+      </w:r>
+      <w:proofErr w:type="gramEnd"/>
+      <w:r>
+        <w:rPr>
+          <w:rFonts w:ascii="Times New Roman" w:eastAsia="Aptos" w:hAnsi="Times New Roman" w:cs="Times New Roman"/>
+          <w:sz w:val="22"/>
+          <w:szCs w:val="22"/>
+        </w:rPr>
+        <w:t xml:space="preserve"> did not file or serve</w:t>
+      </w:r>
+      <w:r>
+        <w:rPr>
+          <w:rFonts w:ascii="Times New Roman" w:eastAsia="Aptos" w:hAnsi="Times New Roman" w:cs="Times New Roman"/>
+          <w:sz w:val="22"/>
+          <w:szCs w:val="22"/>
+        </w:rPr>
+        <w:t xml:space="preserve"> an answer or take other action permitted by law in response to </w:t>
+      </w:r>
+      <w:r>
+        <w:rPr>
+          <w:rFonts w:ascii="Times New Roman" w:eastAsia="Aptos" w:hAnsi="Times New Roman" w:cs="Times New Roman"/>
+          <w:sz w:val="22"/>
+          <w:szCs w:val="22"/>
+        </w:rPr>
+        <w:t>the Complaint</w:t>
+      </w:r>
+      <w:r>
+        <w:rPr>
+          <w:rFonts w:ascii="Times New Roman" w:eastAsia="Aptos" w:hAnsi="Times New Roman" w:cs="Times New Roman"/>
+          <w:sz w:val="22"/>
+          <w:szCs w:val="22"/>
+        </w:rPr>
+        <w:t xml:space="preserve">, or </w:t>
+      </w:r>
+      <w:proofErr w:type="gramStart"/>
+      <w:r>
+        <w:rPr>
+          <w:rFonts w:ascii="Times New Roman" w:eastAsia="Aptos" w:hAnsi="Times New Roman" w:cs="Times New Roman"/>
+          <w:sz w:val="22"/>
+          <w:szCs w:val="22"/>
+        </w:rPr>
+        <w:t>[ ]</w:t>
+      </w:r>
+      <w:proofErr w:type="gramEnd"/>
+      <w:r>
+        <w:rPr>
+          <w:rFonts w:ascii="Times New Roman" w:eastAsia="Aptos" w:hAnsi="Times New Roman" w:cs="Times New Roman"/>
+          <w:sz w:val="22"/>
+          <w:szCs w:val="22"/>
+        </w:rPr>
+        <w:t xml:space="preserve"> did not appear at a court-ordered hearing.</w:t>
+      </w:r>
+    </w:p>
+    <w:p>
+      <w:pPr>
+        <w:spacing w:line="240" w:lineRule="auto"/>
         <w:ind w:left="360"/>
         <w:rPr>
           <w:rFonts w:ascii="Times New Roman" w:eastAsia="Aptos" w:hAnsi="Times New Roman" w:cs="Times New Roman"/>
@@ -2285,15 +2467,362 @@
           <w:sz w:val="22"/>
           <w:szCs w:val="22"/>
         </w:rPr>
-        <w:t xml:space="preserve">Defendant has not filed or served an answer or taken any other action permitted by law in response to </w:t>
-      </w:r>
-      <w:r>
-        <w:rPr>
-          <w:rFonts w:ascii="Times New Roman" w:eastAsia="Aptos" w:hAnsi="Times New Roman" w:cs="Times New Roman"/>
-          <w:sz w:val="22"/>
-          <w:szCs w:val="22"/>
-        </w:rPr>
-        <w:t>the Complaint</w:t>
+        <w:t xml:space="preserve">{%p </w:t>
+      </w:r>
+      <w:proofErr w:type="gramStart"/>
+      <w:r>
+        <w:rPr>
+          <w:rFonts w:ascii="Times New Roman" w:eastAsia="Aptos" w:hAnsi="Times New Roman" w:cs="Times New Roman"/>
+          <w:sz w:val="22"/>
+          <w:szCs w:val="22"/>
+        </w:rPr>
+        <w:t>else %}</w:t>
+      </w:r>
+      <w:proofErr w:type="gramEnd"/>
+    </w:p>
+    <w:p>
+      <w:pPr>
+        <w:pStyle w:val="ListParagraph"/>
+        <w:numPr>
+          <w:ilvl w:val="0"/>
+          <w:numId w:val="6"/>
+        </w:numPr>
+        <w:contextualSpacing w:val="0"/>
+        <w:rPr>
+          <w:rFonts w:ascii="Times New Roman" w:eastAsia="Aptos" w:hAnsi="Times New Roman" w:cs="Times New Roman"/>
+          <w:sz w:val="22"/>
+          <w:szCs w:val="22"/>
+        </w:rPr>
+      </w:pPr>
+      <w:r>
+        <w:rPr>
+          <w:rFonts w:ascii="Times New Roman" w:eastAsia="Aptos" w:hAnsi="Times New Roman" w:cs="Times New Roman"/>
+          <w:sz w:val="22"/>
+          <w:szCs w:val="22"/>
+        </w:rPr>
+        <w:lastRenderedPageBreak/>
+        <w:t xml:space="preserve">I was served with the Plaintiff’s Summons and Complaint for Divorce on _____________ (date) by </w:t>
+      </w:r>
+      <w:proofErr w:type="gramStart"/>
+      <w:r>
+        <w:rPr>
+          <w:rFonts w:ascii="Times New Roman" w:eastAsia="Aptos" w:hAnsi="Times New Roman" w:cs="Times New Roman"/>
+          <w:sz w:val="22"/>
+          <w:szCs w:val="22"/>
+        </w:rPr>
+        <w:t>[  ]</w:t>
+      </w:r>
+      <w:proofErr w:type="gramEnd"/>
+      <w:r>
+        <w:rPr>
+          <w:rFonts w:ascii="Times New Roman" w:eastAsia="Aptos" w:hAnsi="Times New Roman" w:cs="Times New Roman"/>
+          <w:sz w:val="22"/>
+          <w:szCs w:val="22"/>
+        </w:rPr>
+        <w:t xml:space="preserve"> personal delivery </w:t>
+      </w:r>
+      <w:proofErr w:type="gramStart"/>
+      <w:r>
+        <w:rPr>
+          <w:rFonts w:ascii="Times New Roman" w:eastAsia="Aptos" w:hAnsi="Times New Roman" w:cs="Times New Roman"/>
+          <w:sz w:val="22"/>
+          <w:szCs w:val="22"/>
+        </w:rPr>
+        <w:t>[ ]</w:t>
+      </w:r>
+      <w:proofErr w:type="gramEnd"/>
+      <w:r>
+        <w:rPr>
+          <w:rFonts w:ascii="Times New Roman" w:eastAsia="Aptos" w:hAnsi="Times New Roman" w:cs="Times New Roman"/>
+          <w:sz w:val="22"/>
+          <w:szCs w:val="22"/>
+        </w:rPr>
+        <w:t xml:space="preserve"> certified or registered mail. I received the Summons and Complaint </w:t>
+      </w:r>
+      <w:r>
+        <w:rPr>
+          <w:rFonts w:ascii="Times New Roman" w:eastAsia="Aptos" w:hAnsi="Times New Roman" w:cs="Times New Roman"/>
+          <w:sz w:val="22"/>
+          <w:szCs w:val="22"/>
+        </w:rPr>
+        <w:br/>
+      </w:r>
+      <w:proofErr w:type="gramStart"/>
+      <w:r>
+        <w:rPr>
+          <w:rFonts w:ascii="Times New Roman" w:eastAsia="Aptos" w:hAnsi="Times New Roman" w:cs="Times New Roman"/>
+          <w:sz w:val="22"/>
+          <w:szCs w:val="22"/>
+        </w:rPr>
+        <w:t>[ ]</w:t>
+      </w:r>
+      <w:proofErr w:type="gramEnd"/>
+      <w:r>
+        <w:rPr>
+          <w:rFonts w:ascii="Times New Roman" w:eastAsia="Aptos" w:hAnsi="Times New Roman" w:cs="Times New Roman"/>
+          <w:sz w:val="22"/>
+          <w:szCs w:val="22"/>
+        </w:rPr>
+        <w:t xml:space="preserve"> in Michigan </w:t>
+      </w:r>
+      <w:proofErr w:type="gramStart"/>
+      <w:r>
+        <w:rPr>
+          <w:rFonts w:ascii="Times New Roman" w:eastAsia="Aptos" w:hAnsi="Times New Roman" w:cs="Times New Roman"/>
+          <w:sz w:val="22"/>
+          <w:szCs w:val="22"/>
+        </w:rPr>
+        <w:t>[ ]</w:t>
+      </w:r>
+      <w:proofErr w:type="gramEnd"/>
+      <w:r>
+        <w:rPr>
+          <w:rFonts w:ascii="Times New Roman" w:eastAsia="Aptos" w:hAnsi="Times New Roman" w:cs="Times New Roman"/>
+          <w:sz w:val="22"/>
+          <w:szCs w:val="22"/>
+        </w:rPr>
+        <w:t xml:space="preserve"> outside Michigan.</w:t>
+      </w:r>
+    </w:p>
+    <w:p>
+      <w:pPr>
+        <w:pStyle w:val="ListParagraph"/>
+        <w:numPr>
+          <w:ilvl w:val="0"/>
+          <w:numId w:val="6"/>
+        </w:numPr>
+        <w:spacing w:before="240"/>
+        <w:contextualSpacing w:val="0"/>
+        <w:rPr>
+          <w:rFonts w:ascii="Times New Roman" w:eastAsia="Aptos" w:hAnsi="Times New Roman" w:cs="Times New Roman"/>
+          <w:sz w:val="22"/>
+          <w:szCs w:val="22"/>
+        </w:rPr>
+      </w:pPr>
+      <w:r>
+        <w:rPr>
+          <w:rFonts w:ascii="Times New Roman" w:eastAsia="Aptos" w:hAnsi="Times New Roman" w:cs="Times New Roman"/>
+          <w:sz w:val="22"/>
+          <w:szCs w:val="22"/>
+        </w:rPr>
+        <w:t>I filed a timely Answer and Counterclaim for Divorce on _____________ (date</w:t>
+      </w:r>
+      <w:proofErr w:type="gramStart"/>
+      <w:r>
+        <w:rPr>
+          <w:rFonts w:ascii="Times New Roman" w:eastAsia="Aptos" w:hAnsi="Times New Roman" w:cs="Times New Roman"/>
+          <w:sz w:val="22"/>
+          <w:szCs w:val="22"/>
+        </w:rPr>
+        <w:t>), and</w:t>
+      </w:r>
+      <w:proofErr w:type="gramEnd"/>
+      <w:r>
+        <w:rPr>
+          <w:rFonts w:ascii="Times New Roman" w:eastAsia="Aptos" w:hAnsi="Times New Roman" w:cs="Times New Roman"/>
+          <w:sz w:val="22"/>
+          <w:szCs w:val="22"/>
+        </w:rPr>
+        <w:t xml:space="preserve"> properly served the Plaintiff on ___________</w:t>
+      </w:r>
+      <w:proofErr w:type="gramStart"/>
+      <w:r>
+        <w:rPr>
+          <w:rFonts w:ascii="Times New Roman" w:eastAsia="Aptos" w:hAnsi="Times New Roman" w:cs="Times New Roman"/>
+          <w:sz w:val="22"/>
+          <w:szCs w:val="22"/>
+        </w:rPr>
+        <w:t>_( date</w:t>
+      </w:r>
+      <w:proofErr w:type="gramEnd"/>
+      <w:r>
+        <w:rPr>
+          <w:rFonts w:ascii="Times New Roman" w:eastAsia="Aptos" w:hAnsi="Times New Roman" w:cs="Times New Roman"/>
+          <w:sz w:val="22"/>
+          <w:szCs w:val="22"/>
+        </w:rPr>
+        <w:t>).</w:t>
+      </w:r>
+    </w:p>
+    <w:p>
+      <w:pPr>
+        <w:pStyle w:val="ListParagraph"/>
+        <w:numPr>
+          <w:ilvl w:val="0"/>
+          <w:numId w:val="6"/>
+        </w:numPr>
+        <w:contextualSpacing w:val="0"/>
+        <w:rPr>
+          <w:rFonts w:ascii="Times New Roman" w:eastAsia="Aptos" w:hAnsi="Times New Roman" w:cs="Times New Roman"/>
+          <w:sz w:val="22"/>
+          <w:szCs w:val="22"/>
+        </w:rPr>
+      </w:pPr>
+      <w:r>
+        <w:rPr>
+          <w:rFonts w:ascii="Times New Roman" w:eastAsia="Aptos" w:hAnsi="Times New Roman" w:cs="Times New Roman"/>
+          <w:sz w:val="22"/>
+          <w:szCs w:val="22"/>
+        </w:rPr>
+        <w:t xml:space="preserve">The Plaintiff </w:t>
+      </w:r>
+      <w:proofErr w:type="gramStart"/>
+      <w:r>
+        <w:rPr>
+          <w:rFonts w:ascii="Times New Roman" w:eastAsia="Aptos" w:hAnsi="Times New Roman" w:cs="Times New Roman"/>
+          <w:sz w:val="22"/>
+          <w:szCs w:val="22"/>
+        </w:rPr>
+        <w:t>[ ]</w:t>
+      </w:r>
+      <w:proofErr w:type="gramEnd"/>
+      <w:r>
+        <w:rPr>
+          <w:rFonts w:ascii="Times New Roman" w:eastAsia="Aptos" w:hAnsi="Times New Roman" w:cs="Times New Roman"/>
+          <w:sz w:val="22"/>
+          <w:szCs w:val="22"/>
+        </w:rPr>
+        <w:t xml:space="preserve"> did not file or serve an answer or take other action permitted by law in response to the counterclaim within 21 days after service, or </w:t>
+      </w:r>
+      <w:proofErr w:type="gramStart"/>
+      <w:r>
+        <w:rPr>
+          <w:rFonts w:ascii="Times New Roman" w:eastAsia="Aptos" w:hAnsi="Times New Roman" w:cs="Times New Roman"/>
+          <w:sz w:val="22"/>
+          <w:szCs w:val="22"/>
+        </w:rPr>
+        <w:t>[ ]</w:t>
+      </w:r>
+      <w:proofErr w:type="gramEnd"/>
+      <w:r>
+        <w:rPr>
+          <w:rFonts w:ascii="Times New Roman" w:eastAsia="Aptos" w:hAnsi="Times New Roman" w:cs="Times New Roman"/>
+          <w:sz w:val="22"/>
+          <w:szCs w:val="22"/>
+        </w:rPr>
+        <w:t xml:space="preserve"> did not appear at a court-ordered hearing.</w:t>
+      </w:r>
+    </w:p>
+    <w:p>
+      <w:pPr>
+        <w:spacing w:line="240" w:lineRule="auto"/>
+        <w:ind w:left="360"/>
+        <w:rPr>
+          <w:rFonts w:ascii="Times New Roman" w:eastAsia="Aptos" w:hAnsi="Times New Roman" w:cs="Times New Roman"/>
+          <w:sz w:val="22"/>
+          <w:szCs w:val="22"/>
+        </w:rPr>
+      </w:pPr>
+      <w:r>
+        <w:rPr>
+          <w:rFonts w:ascii="Times New Roman" w:eastAsia="Aptos" w:hAnsi="Times New Roman" w:cs="Times New Roman"/>
+          <w:sz w:val="22"/>
+          <w:szCs w:val="22"/>
+        </w:rPr>
+        <w:t xml:space="preserve">{%p </w:t>
+      </w:r>
+      <w:proofErr w:type="gramStart"/>
+      <w:r>
+        <w:rPr>
+          <w:rFonts w:ascii="Times New Roman" w:eastAsia="Aptos" w:hAnsi="Times New Roman" w:cs="Times New Roman"/>
+          <w:sz w:val="22"/>
+          <w:szCs w:val="22"/>
+        </w:rPr>
+        <w:t>endif %}</w:t>
+      </w:r>
+      <w:proofErr w:type="gramEnd"/>
+    </w:p>
+    <w:p>
+      <w:pPr>
+        <w:pStyle w:val="ListParagraph"/>
+        <w:numPr>
+          <w:ilvl w:val="0"/>
+          <w:numId w:val="6"/>
+        </w:numPr>
+        <w:spacing w:line="240" w:lineRule="auto"/>
+        <w:rPr>
+          <w:rFonts w:ascii="Times New Roman" w:eastAsia="Aptos" w:hAnsi="Times New Roman" w:cs="Times New Roman"/>
+          <w:sz w:val="22"/>
+          <w:szCs w:val="22"/>
+        </w:rPr>
+      </w:pPr>
+      <w:r>
+        <w:rPr>
+          <w:rFonts w:ascii="Times New Roman" w:eastAsia="Aptos" w:hAnsi="Times New Roman" w:cs="Times New Roman"/>
+          <w:sz w:val="22"/>
+          <w:szCs w:val="22"/>
+        </w:rPr>
+        <w:t xml:space="preserve">A default was entered on </w:t>
+      </w:r>
+      <w:r>
+        <w:rPr>
+          <w:rFonts w:ascii="Times New Roman" w:eastAsia="Aptos" w:hAnsi="Times New Roman" w:cs="Times New Roman"/>
+          <w:sz w:val="22"/>
+          <w:szCs w:val="22"/>
+        </w:rPr>
+        <w:t xml:space="preserve">___________(date), and notice was sent to the </w:t>
+      </w:r>
+      <w:r>
+        <w:rPr>
+          <w:rFonts w:ascii="Times New Roman" w:eastAsia="Aptos" w:hAnsi="Times New Roman" w:cs="Times New Roman"/>
+          <w:sz w:val="22"/>
+          <w:szCs w:val="22"/>
+        </w:rPr>
+        <w:t xml:space="preserve">{% if </w:t>
+      </w:r>
+      <w:proofErr w:type="spellStart"/>
+      <w:r>
+        <w:rPr>
+          <w:rFonts w:ascii="Times New Roman" w:eastAsia="Aptos" w:hAnsi="Times New Roman" w:cs="Times New Roman"/>
+          <w:sz w:val="22"/>
+          <w:szCs w:val="22"/>
+        </w:rPr>
+        <w:t>user_ask_role</w:t>
+      </w:r>
+      <w:proofErr w:type="spellEnd"/>
+      <w:r>
+        <w:rPr>
+          <w:rFonts w:ascii="Times New Roman" w:eastAsia="Aptos" w:hAnsi="Times New Roman" w:cs="Times New Roman"/>
+          <w:sz w:val="22"/>
+          <w:szCs w:val="22"/>
+        </w:rPr>
+        <w:t xml:space="preserve"> == “plaintiff” </w:t>
+      </w:r>
+      <w:proofErr w:type="gramStart"/>
+      <w:r>
+        <w:rPr>
+          <w:rFonts w:ascii="Times New Roman" w:eastAsia="Aptos" w:hAnsi="Times New Roman" w:cs="Times New Roman"/>
+          <w:sz w:val="22"/>
+          <w:szCs w:val="22"/>
+        </w:rPr>
+        <w:t>%}Defendant</w:t>
+      </w:r>
+      <w:proofErr w:type="gramEnd"/>
+      <w:r>
+        <w:rPr>
+          <w:rFonts w:ascii="Times New Roman" w:eastAsia="Aptos" w:hAnsi="Times New Roman" w:cs="Times New Roman"/>
+          <w:sz w:val="22"/>
+          <w:szCs w:val="22"/>
+        </w:rPr>
+        <w:t xml:space="preserve">{% else </w:t>
+      </w:r>
+      <w:proofErr w:type="gramStart"/>
+      <w:r>
+        <w:rPr>
+          <w:rFonts w:ascii="Times New Roman" w:eastAsia="Aptos" w:hAnsi="Times New Roman" w:cs="Times New Roman"/>
+          <w:sz w:val="22"/>
+          <w:szCs w:val="22"/>
+        </w:rPr>
+        <w:t>%}Plaintiff</w:t>
+      </w:r>
+      <w:proofErr w:type="gramEnd"/>
+      <w:r>
+        <w:rPr>
+          <w:rFonts w:ascii="Times New Roman" w:eastAsia="Aptos" w:hAnsi="Times New Roman" w:cs="Times New Roman"/>
+          <w:sz w:val="22"/>
+          <w:szCs w:val="22"/>
+        </w:rPr>
+        <w:t>{% endif %}</w:t>
       </w:r>
       <w:r>
         <w:rPr>
@@ -2312,23 +2841,13 @@
           <w:ilvl w:val="0"/>
           <w:numId w:val="6"/>
         </w:numPr>
-        <w:spacing w:after="0" w:line="240" w:lineRule="auto"/>
-        <w:ind w:left="360"/>
-        <w:contextualSpacing/>
-        <w:rPr>
-          <w:rFonts w:ascii="Times New Roman" w:eastAsia="Aptos" w:hAnsi="Times New Roman" w:cs="Times New Roman"/>
-          <w:sz w:val="22"/>
-          <w:szCs w:val="22"/>
-        </w:rPr>
-      </w:pPr>
-      <w:r>
-        <w:rPr>
-          <w:rFonts w:ascii="Times New Roman" w:eastAsia="Aptos" w:hAnsi="Times New Roman" w:cs="Times New Roman"/>
-          <w:sz w:val="22"/>
-          <w:szCs w:val="22"/>
-        </w:rPr>
-        <w:t xml:space="preserve">Defendant was served at least 14 days before the scheduled hearing with the (1) Default Request and Entry, (2) this notice of hearing and motion, </w:t>
-      </w:r>
+        <w:spacing w:line="240" w:lineRule="auto"/>
+        <w:rPr>
+          <w:rFonts w:ascii="Times New Roman" w:eastAsia="Aptos" w:hAnsi="Times New Roman" w:cs="Times New Roman"/>
+          <w:sz w:val="22"/>
+          <w:szCs w:val="22"/>
+        </w:rPr>
+      </w:pPr>
       <w:r>
         <w:rPr>
           <w:rFonts w:ascii="Times New Roman" w:eastAsia="Aptos" w:hAnsi="Times New Roman" w:cs="Times New Roman"/>
@@ -2344,6 +2863,56 @@
           <w:sz w:val="22"/>
           <w:szCs w:val="22"/>
         </w:rPr>
+        <w:t>user_ask_role</w:t>
+      </w:r>
+      <w:proofErr w:type="spellEnd"/>
+      <w:r>
+        <w:rPr>
+          <w:rFonts w:ascii="Times New Roman" w:eastAsia="Aptos" w:hAnsi="Times New Roman" w:cs="Times New Roman"/>
+          <w:sz w:val="22"/>
+          <w:szCs w:val="22"/>
+        </w:rPr>
+        <w:t xml:space="preserve"> == “plaintiff” %}Defendant{% else %}Plaintiff{% endif %}</w:t>
+      </w:r>
+      <w:r>
+        <w:rPr>
+          <w:rFonts w:ascii="Times New Roman" w:eastAsia="Aptos" w:hAnsi="Times New Roman" w:cs="Times New Roman"/>
+          <w:sz w:val="22"/>
+          <w:szCs w:val="22"/>
+        </w:rPr>
+        <w:t xml:space="preserve"> was served at least 14 days before the scheduled hearing with the (</w:t>
+      </w:r>
+      <w:r>
+        <w:rPr>
+          <w:rFonts w:ascii="Times New Roman" w:eastAsia="Aptos" w:hAnsi="Times New Roman" w:cs="Times New Roman"/>
+          <w:sz w:val="22"/>
+          <w:szCs w:val="22"/>
+        </w:rPr>
+        <w:t>1</w:t>
+      </w:r>
+      <w:r>
+        <w:rPr>
+          <w:rFonts w:ascii="Times New Roman" w:eastAsia="Aptos" w:hAnsi="Times New Roman" w:cs="Times New Roman"/>
+          <w:sz w:val="22"/>
+          <w:szCs w:val="22"/>
+        </w:rPr>
+        <w:t xml:space="preserve">) this notice of hearing and motion, </w:t>
+      </w:r>
+      <w:r>
+        <w:rPr>
+          <w:rFonts w:ascii="Times New Roman" w:eastAsia="Aptos" w:hAnsi="Times New Roman" w:cs="Times New Roman"/>
+          <w:sz w:val="22"/>
+          <w:szCs w:val="22"/>
+        </w:rPr>
+        <w:t xml:space="preserve">{% if </w:t>
+      </w:r>
+      <w:proofErr w:type="spellStart"/>
+      <w:r>
+        <w:rPr>
+          <w:rFonts w:ascii="Times New Roman" w:eastAsia="Aptos" w:hAnsi="Times New Roman" w:cs="Times New Roman"/>
+          <w:sz w:val="22"/>
+          <w:szCs w:val="22"/>
+        </w:rPr>
         <w:t>tool_ID</w:t>
       </w:r>
       <w:proofErr w:type="spellEnd"/>
@@ -2502,7 +3071,23 @@
           <w:sz w:val="22"/>
           <w:szCs w:val="22"/>
         </w:rPr>
-        <w:t>and (3) a proposed Judgment of Divorce</w:t>
+        <w:t>and (</w:t>
+      </w:r>
+      <w:r>
+        <w:rPr>
+          <w:rFonts w:ascii="Times New Roman" w:eastAsia="Aptos" w:hAnsi="Times New Roman" w:cs="Times New Roman"/>
+          <w:sz w:val="22"/>
+          <w:szCs w:val="22"/>
+        </w:rPr>
+        <w:t>2</w:t>
+      </w:r>
+      <w:r>
+        <w:rPr>
+          <w:rFonts w:ascii="Times New Roman" w:eastAsia="Aptos" w:hAnsi="Times New Roman" w:cs="Times New Roman"/>
+          <w:sz w:val="22"/>
+          <w:szCs w:val="22"/>
+        </w:rPr>
+        <w:t>) a proposed Judgment of Divorce</w:t>
       </w:r>
       <w:r>
         <w:rPr>
@@ -2619,7 +3204,39 @@
           <w:sz w:val="22"/>
           <w:szCs w:val="22"/>
         </w:rPr>
-        <w:t>(3) a proposed Judgment of Divorce, and (4) a proposed Uniform Child Support Order</w:t>
+        <w:t>(</w:t>
+      </w:r>
+      <w:r>
+        <w:rPr>
+          <w:rFonts w:ascii="Times New Roman" w:eastAsia="Aptos" w:hAnsi="Times New Roman" w:cs="Times New Roman"/>
+          <w:sz w:val="22"/>
+          <w:szCs w:val="22"/>
+        </w:rPr>
+        <w:t>2</w:t>
+      </w:r>
+      <w:r>
+        <w:rPr>
+          <w:rFonts w:ascii="Times New Roman" w:eastAsia="Aptos" w:hAnsi="Times New Roman" w:cs="Times New Roman"/>
+          <w:sz w:val="22"/>
+          <w:szCs w:val="22"/>
+        </w:rPr>
+        <w:t>) a proposed Judgment of Divorce, and (</w:t>
+      </w:r>
+      <w:r>
+        <w:rPr>
+          <w:rFonts w:ascii="Times New Roman" w:eastAsia="Aptos" w:hAnsi="Times New Roman" w:cs="Times New Roman"/>
+          <w:sz w:val="22"/>
+          <w:szCs w:val="22"/>
+        </w:rPr>
+        <w:t>3</w:t>
+      </w:r>
+      <w:r>
+        <w:rPr>
+          <w:rFonts w:ascii="Times New Roman" w:eastAsia="Aptos" w:hAnsi="Times New Roman" w:cs="Times New Roman"/>
+          <w:sz w:val="22"/>
+          <w:szCs w:val="22"/>
+        </w:rPr>
+        <w:t>) a proposed Uniform Child Support Order</w:t>
       </w:r>
       <w:r>
         <w:rPr>
@@ -2736,7 +3353,39 @@
           <w:sz w:val="22"/>
           <w:szCs w:val="22"/>
         </w:rPr>
-        <w:t>(3) a proposed Judgment of Divorce, and (4) a proposed Uniform Spousal Support Order</w:t>
+        <w:t>(</w:t>
+      </w:r>
+      <w:r>
+        <w:rPr>
+          <w:rFonts w:ascii="Times New Roman" w:eastAsia="Aptos" w:hAnsi="Times New Roman" w:cs="Times New Roman"/>
+          <w:sz w:val="22"/>
+          <w:szCs w:val="22"/>
+        </w:rPr>
+        <w:t>2</w:t>
+      </w:r>
+      <w:r>
+        <w:rPr>
+          <w:rFonts w:ascii="Times New Roman" w:eastAsia="Aptos" w:hAnsi="Times New Roman" w:cs="Times New Roman"/>
+          <w:sz w:val="22"/>
+          <w:szCs w:val="22"/>
+        </w:rPr>
+        <w:t>) a proposed Judgment of Divorce, and (</w:t>
+      </w:r>
+      <w:r>
+        <w:rPr>
+          <w:rFonts w:ascii="Times New Roman" w:eastAsia="Aptos" w:hAnsi="Times New Roman" w:cs="Times New Roman"/>
+          <w:sz w:val="22"/>
+          <w:szCs w:val="22"/>
+        </w:rPr>
+        <w:t>3</w:t>
+      </w:r>
+      <w:r>
+        <w:rPr>
+          <w:rFonts w:ascii="Times New Roman" w:eastAsia="Aptos" w:hAnsi="Times New Roman" w:cs="Times New Roman"/>
+          <w:sz w:val="22"/>
+          <w:szCs w:val="22"/>
+        </w:rPr>
+        <w:t>) a proposed Uniform Spousal Support Order</w:t>
       </w:r>
       <w:r>
         <w:rPr>
@@ -2853,7 +3502,55 @@
           <w:sz w:val="22"/>
           <w:szCs w:val="22"/>
         </w:rPr>
-        <w:t>(3) a proposed Judgment of Divorce, (4) a proposed Uniform Child Support Order, and (5) a proposed Uniform Spousal Support Order</w:t>
+        <w:t>(</w:t>
+      </w:r>
+      <w:r>
+        <w:rPr>
+          <w:rFonts w:ascii="Times New Roman" w:eastAsia="Aptos" w:hAnsi="Times New Roman" w:cs="Times New Roman"/>
+          <w:sz w:val="22"/>
+          <w:szCs w:val="22"/>
+        </w:rPr>
+        <w:t>2</w:t>
+      </w:r>
+      <w:r>
+        <w:rPr>
+          <w:rFonts w:ascii="Times New Roman" w:eastAsia="Aptos" w:hAnsi="Times New Roman" w:cs="Times New Roman"/>
+          <w:sz w:val="22"/>
+          <w:szCs w:val="22"/>
+        </w:rPr>
+        <w:t>) a proposed Judgment of Divorce, (</w:t>
+      </w:r>
+      <w:r>
+        <w:rPr>
+          <w:rFonts w:ascii="Times New Roman" w:eastAsia="Aptos" w:hAnsi="Times New Roman" w:cs="Times New Roman"/>
+          <w:sz w:val="22"/>
+          <w:szCs w:val="22"/>
+        </w:rPr>
+        <w:t>3</w:t>
+      </w:r>
+      <w:r>
+        <w:rPr>
+          <w:rFonts w:ascii="Times New Roman" w:eastAsia="Aptos" w:hAnsi="Times New Roman" w:cs="Times New Roman"/>
+          <w:sz w:val="22"/>
+          <w:szCs w:val="22"/>
+        </w:rPr>
+        <w:t>) a proposed Uniform Child Support Order, and (</w:t>
+      </w:r>
+      <w:r>
+        <w:rPr>
+          <w:rFonts w:ascii="Times New Roman" w:eastAsia="Aptos" w:hAnsi="Times New Roman" w:cs="Times New Roman"/>
+          <w:sz w:val="22"/>
+          <w:szCs w:val="22"/>
+        </w:rPr>
+        <w:t>4</w:t>
+      </w:r>
+      <w:r>
+        <w:rPr>
+          <w:rFonts w:ascii="Times New Roman" w:eastAsia="Aptos" w:hAnsi="Times New Roman" w:cs="Times New Roman"/>
+          <w:sz w:val="22"/>
+          <w:szCs w:val="22"/>
+        </w:rPr>
+        <w:t>) a proposed Uniform Spousal Support Order</w:t>
       </w:r>
       <w:r>
         <w:rPr>
@@ -2932,7 +3629,39 @@
           <w:sz w:val="22"/>
           <w:szCs w:val="22"/>
         </w:rPr>
-        <w:t>(3) a proposed Order Regarding Custody, Parenting Time, and Child Support, and (4) a proposed Uniform Child Support Order</w:t>
+        <w:t>(</w:t>
+      </w:r>
+      <w:r>
+        <w:rPr>
+          <w:rFonts w:ascii="Times New Roman" w:eastAsia="Aptos" w:hAnsi="Times New Roman" w:cs="Times New Roman"/>
+          <w:sz w:val="22"/>
+          <w:szCs w:val="22"/>
+        </w:rPr>
+        <w:t>2</w:t>
+      </w:r>
+      <w:r>
+        <w:rPr>
+          <w:rFonts w:ascii="Times New Roman" w:eastAsia="Aptos" w:hAnsi="Times New Roman" w:cs="Times New Roman"/>
+          <w:sz w:val="22"/>
+          <w:szCs w:val="22"/>
+        </w:rPr>
+        <w:t>) a proposed Order Regarding Custody, Parenting Time, and Child Support, and (</w:t>
+      </w:r>
+      <w:r>
+        <w:rPr>
+          <w:rFonts w:ascii="Times New Roman" w:eastAsia="Aptos" w:hAnsi="Times New Roman" w:cs="Times New Roman"/>
+          <w:sz w:val="22"/>
+          <w:szCs w:val="22"/>
+        </w:rPr>
+        <w:t>3</w:t>
+      </w:r>
+      <w:r>
+        <w:rPr>
+          <w:rFonts w:ascii="Times New Roman" w:eastAsia="Aptos" w:hAnsi="Times New Roman" w:cs="Times New Roman"/>
+          <w:sz w:val="22"/>
+          <w:szCs w:val="22"/>
+        </w:rPr>
+        <w:t>) a proposed Uniform Child Support Order</w:t>
       </w:r>
       <w:r>
         <w:rPr>
@@ -2953,7 +3682,7 @@
     </w:p>
     <w:p>
       <w:pPr>
-        <w:spacing w:after="0" w:line="240" w:lineRule="auto"/>
+        <w:spacing w:line="240" w:lineRule="auto"/>
         <w:rPr>
           <w:rFonts w:ascii="Times New Roman" w:eastAsia="Aptos" w:hAnsi="Times New Roman" w:cs="Times New Roman"/>
           <w:sz w:val="22"/>
@@ -3970,6 +4699,95 @@
       </w:pPr>
     </w:lvl>
     <w:lvl w:ilvl="1" w:tplc="04090019">
+      <w:start w:val="1"/>
+      <w:numFmt w:val="lowerLetter"/>
+      <w:lvlText w:val="%2."/>
+      <w:lvlJc w:val="left"/>
+      <w:pPr>
+        <w:ind w:left="1440" w:hanging="360"/>
+      </w:pPr>
+    </w:lvl>
+    <w:lvl w:ilvl="2" w:tplc="0409001B" w:tentative="1">
+      <w:start w:val="1"/>
+      <w:numFmt w:val="lowerRoman"/>
+      <w:lvlText w:val="%3."/>
+      <w:lvlJc w:val="right"/>
+      <w:pPr>
+        <w:ind w:left="2160" w:hanging="180"/>
+      </w:pPr>
+    </w:lvl>
+    <w:lvl w:ilvl="3" w:tplc="0409000F" w:tentative="1">
+      <w:start w:val="1"/>
+      <w:numFmt w:val="decimal"/>
+      <w:lvlText w:val="%4."/>
+      <w:lvlJc w:val="left"/>
+      <w:pPr>
+        <w:ind w:left="2880" w:hanging="360"/>
+      </w:pPr>
+    </w:lvl>
+    <w:lvl w:ilvl="4" w:tplc="04090019" w:tentative="1">
+      <w:start w:val="1"/>
+      <w:numFmt w:val="lowerLetter"/>
+      <w:lvlText w:val="%5."/>
+      <w:lvlJc w:val="left"/>
+      <w:pPr>
+        <w:ind w:left="3600" w:hanging="360"/>
+      </w:pPr>
+    </w:lvl>
+    <w:lvl w:ilvl="5" w:tplc="0409001B" w:tentative="1">
+      <w:start w:val="1"/>
+      <w:numFmt w:val="lowerRoman"/>
+      <w:lvlText w:val="%6."/>
+      <w:lvlJc w:val="right"/>
+      <w:pPr>
+        <w:ind w:left="4320" w:hanging="180"/>
+      </w:pPr>
+    </w:lvl>
+    <w:lvl w:ilvl="6" w:tplc="0409000F" w:tentative="1">
+      <w:start w:val="1"/>
+      <w:numFmt w:val="decimal"/>
+      <w:lvlText w:val="%7."/>
+      <w:lvlJc w:val="left"/>
+      <w:pPr>
+        <w:ind w:left="5040" w:hanging="360"/>
+      </w:pPr>
+    </w:lvl>
+    <w:lvl w:ilvl="7" w:tplc="04090019" w:tentative="1">
+      <w:start w:val="1"/>
+      <w:numFmt w:val="lowerLetter"/>
+      <w:lvlText w:val="%8."/>
+      <w:lvlJc w:val="left"/>
+      <w:pPr>
+        <w:ind w:left="5760" w:hanging="360"/>
+      </w:pPr>
+    </w:lvl>
+    <w:lvl w:ilvl="8" w:tplc="0409001B" w:tentative="1">
+      <w:start w:val="1"/>
+      <w:numFmt w:val="lowerRoman"/>
+      <w:lvlText w:val="%9."/>
+      <w:lvlJc w:val="right"/>
+      <w:pPr>
+        <w:ind w:left="6480" w:hanging="180"/>
+      </w:pPr>
+    </w:lvl>
+  </w:abstractNum>
+  <w:abstractNum w:abstractNumId="4" w15:restartNumberingAfterBreak="0">
+    <w:nsid w:val="792B2AF4"/>
+    <w:multiLevelType w:val="hybridMultilevel"/>
+    <w:tmpl w:val="4314E320"/>
+    <w:lvl w:ilvl="0" w:tplc="0409000F">
+      <w:start w:val="1"/>
+      <w:numFmt w:val="decimal"/>
+      <w:lvlText w:val="%1."/>
+      <w:lvlJc w:val="left"/>
+      <w:pPr>
+        <w:ind w:left="720" w:hanging="360"/>
+      </w:pPr>
+      <w:rPr>
+        <w:rFonts w:hint="default"/>
+      </w:rPr>
+    </w:lvl>
+    <w:lvl w:ilvl="1" w:tplc="04090019" w:tentative="1">
       <w:start w:val="1"/>
       <w:numFmt w:val="lowerLetter"/>
       <w:lvlText w:val="%2."/>
@@ -4113,6 +4931,9 @@
     <w:lvlOverride w:ilvl="8">
       <w:startOverride w:val="1"/>
     </w:lvlOverride>
+  </w:num>
+  <w:num w:numId="7" w16cid:durableId="1658921509">
+    <w:abstractNumId w:val="4"/>
   </w:num>
 </w:numbering>
 </file>

</xml_diff>